<commit_message>
Add dataset statistics and manifests for training, validation, and testing splits
- Created split_statistics.json with detailed statistics for train, val, and test splits including samples, speakers, and ratios.
- Added test_speaker_independent.csv and val_speaker_independent.csv manifests for speaker-independent evaluation.
- Introduced unified_dataset_stats.json summarizing overall dataset statistics across all splits, including sample counts, speaker counts, and attack types.
</commit_message>
<xml_diff>
--- a/submissions/proposal/(IST-Dean-F-18)_S_Project Proposal Form-1.docx
+++ b/submissions/proposal/(IST-Dean-F-18)_S_Project Proposal Form-1.docx
@@ -630,6 +630,21 @@
                 <w:szCs w:val="24"/>
               </w:rPr>
             </w:pPr>
+            <w:r>
+              <w:rPr>
+                <w:sz w:val="24"/>
+                <w:szCs w:val="24"/>
+              </w:rPr>
+              <w:t>M. Phil (Cambridge)</w:t>
+            </w:r>
+          </w:p>
+          <w:p>
+            <w:pPr>
+              <w:rPr>
+                <w:sz w:val="24"/>
+                <w:szCs w:val="24"/>
+              </w:rPr>
+            </w:pPr>
           </w:p>
         </w:tc>
         <w:tc>
@@ -656,6 +671,29 @@
           <w:tcPr>
             <w:tcW w:w="3896" w:type="dxa"/>
           </w:tcPr>
+          <w:p>
+            <w:pPr>
+              <w:rPr>
+                <w:sz w:val="24"/>
+                <w:szCs w:val="24"/>
+              </w:rPr>
+            </w:pPr>
+          </w:p>
+          <w:p>
+            <w:pPr>
+              <w:rPr>
+                <w:sz w:val="24"/>
+                <w:szCs w:val="24"/>
+              </w:rPr>
+            </w:pPr>
+            <w:r>
+              <w:rPr>
+                <w:sz w:val="24"/>
+                <w:szCs w:val="24"/>
+              </w:rPr>
+              <w:t>3 journals, 10 conferences</w:t>
+            </w:r>
+          </w:p>
           <w:p>
             <w:pPr>
               <w:rPr>
@@ -1233,6 +1271,13 @@
                 <w:szCs w:val="24"/>
               </w:rPr>
             </w:pPr>
+            <w:r>
+              <w:rPr>
+                <w:sz w:val="24"/>
+                <w:szCs w:val="24"/>
+              </w:rPr>
+              <w:t>System Engineering</w:t>
+            </w:r>
           </w:p>
         </w:tc>
       </w:tr>
@@ -1816,7 +1861,6 @@
                 <w:bCs/>
                 <w:sz w:val="24"/>
                 <w:szCs w:val="24"/>
-                <w:lang/>
               </w:rPr>
             </w:pPr>
             <w:r>
@@ -1824,7 +1868,6 @@
                 <w:bCs/>
                 <w:sz w:val="24"/>
                 <w:szCs w:val="24"/>
-                <w:lang/>
               </w:rPr>
               <w:t>To develop a machine learning model that classifies speech as bonafide (human) or spoof (AI-generated).</w:t>
             </w:r>
@@ -1841,7 +1884,6 @@
                 <w:bCs/>
                 <w:sz w:val="24"/>
                 <w:szCs w:val="24"/>
-                <w:lang/>
               </w:rPr>
             </w:pPr>
             <w:r>
@@ -1849,7 +1891,6 @@
                 <w:bCs/>
                 <w:sz w:val="24"/>
                 <w:szCs w:val="24"/>
-                <w:lang/>
               </w:rPr>
               <w:t>To utilize forensic audio cues—noise patterns, reverberation, channel artifacts—to detect synthetic manipulation.</w:t>
             </w:r>
@@ -1866,7 +1907,6 @@
                 <w:bCs/>
                 <w:sz w:val="24"/>
                 <w:szCs w:val="24"/>
-                <w:lang/>
               </w:rPr>
             </w:pPr>
             <w:r>
@@ -1874,7 +1914,6 @@
                 <w:bCs/>
                 <w:sz w:val="24"/>
                 <w:szCs w:val="24"/>
-                <w:lang/>
               </w:rPr>
               <w:t>To identify when a deepfake voice is embedded into real audio recordings.</w:t>
             </w:r>
@@ -1891,7 +1930,6 @@
                 <w:bCs/>
                 <w:sz w:val="24"/>
                 <w:szCs w:val="24"/>
-                <w:lang/>
               </w:rPr>
             </w:pPr>
             <w:r>
@@ -1899,7 +1937,6 @@
                 <w:bCs/>
                 <w:sz w:val="24"/>
                 <w:szCs w:val="24"/>
-                <w:lang/>
               </w:rPr>
               <w:t>To detect replayed synthetic speech, where AI-generated audio is played on a device and re-recorded.</w:t>
             </w:r>
@@ -1916,7 +1953,6 @@
                 <w:bCs/>
                 <w:sz w:val="24"/>
                 <w:szCs w:val="24"/>
-                <w:lang/>
               </w:rPr>
             </w:pPr>
             <w:r>
@@ -1924,7 +1960,6 @@
                 <w:bCs/>
                 <w:sz w:val="24"/>
                 <w:szCs w:val="24"/>
-                <w:lang/>
               </w:rPr>
               <w:t>To build a robust evaluation pipeline using augmented and real-world testing scenarios.</w:t>
             </w:r>
@@ -1941,7 +1976,6 @@
                 <w:bCs/>
                 <w:sz w:val="24"/>
                 <w:szCs w:val="24"/>
-                <w:lang/>
               </w:rPr>
             </w:pPr>
             <w:r>
@@ -1949,7 +1983,6 @@
                 <w:bCs/>
                 <w:sz w:val="24"/>
                 <w:szCs w:val="24"/>
-                <w:lang/>
               </w:rPr>
               <w:t>To deliver a complete software-based system for deepfake speech detection.</w:t>
             </w:r>
@@ -1964,7 +1997,6 @@
                 <w:b/>
                 <w:sz w:val="24"/>
                 <w:szCs w:val="24"/>
-                <w:lang/>
               </w:rPr>
             </w:pPr>
           </w:p>
@@ -2074,7 +2106,6 @@
                 <w:bCs/>
                 <w:sz w:val="24"/>
                 <w:szCs w:val="24"/>
-                <w:lang/>
               </w:rPr>
             </w:pPr>
             <w:r>
@@ -2082,7 +2113,6 @@
                 <w:bCs/>
                 <w:sz w:val="24"/>
                 <w:szCs w:val="24"/>
-                <w:lang/>
               </w:rPr>
               <w:t>Dataset Preparation: Use ASVspoof 2021 (DeepFake &amp; Logical Access tracks) and create additional augmented datasets with MUSAN noise, RIR-based reverberation, and codec distortions.</w:t>
             </w:r>
@@ -2098,7 +2128,6 @@
                 <w:bCs/>
                 <w:sz w:val="24"/>
                 <w:szCs w:val="24"/>
-                <w:lang/>
               </w:rPr>
             </w:pPr>
             <w:r>
@@ -2106,7 +2135,6 @@
                 <w:bCs/>
                 <w:sz w:val="24"/>
                 <w:szCs w:val="24"/>
-                <w:lang/>
               </w:rPr>
               <w:t>Feature Extraction: Generate LFCC (20-dimensional) and Log-Mel spectrogram (64-dimensional) features from all audio samples.</w:t>
             </w:r>
@@ -2122,7 +2150,6 @@
                 <w:bCs/>
                 <w:sz w:val="24"/>
                 <w:szCs w:val="24"/>
-                <w:lang/>
               </w:rPr>
             </w:pPr>
             <w:r>
@@ -2130,7 +2157,6 @@
                 <w:bCs/>
                 <w:sz w:val="24"/>
                 <w:szCs w:val="24"/>
-                <w:lang/>
               </w:rPr>
               <w:t>Model Development: Implement and train an LCNN-based deep learning model for binary classification (bonafide vs spoof).</w:t>
             </w:r>
@@ -2146,7 +2172,6 @@
                 <w:bCs/>
                 <w:sz w:val="24"/>
                 <w:szCs w:val="24"/>
-                <w:lang/>
               </w:rPr>
             </w:pPr>
             <w:r>
@@ -2154,7 +2179,6 @@
                 <w:bCs/>
                 <w:sz w:val="24"/>
                 <w:szCs w:val="24"/>
-                <w:lang/>
               </w:rPr>
               <w:t>Augmentation &amp; Robustness: Apply noise, replay simulation, and compression to strengthen generalization.</w:t>
             </w:r>
@@ -2170,7 +2194,6 @@
                 <w:bCs/>
                 <w:sz w:val="24"/>
                 <w:szCs w:val="24"/>
-                <w:lang/>
               </w:rPr>
             </w:pPr>
             <w:r>
@@ -2178,7 +2201,6 @@
                 <w:bCs/>
                 <w:sz w:val="24"/>
                 <w:szCs w:val="24"/>
-                <w:lang/>
               </w:rPr>
               <w:t>Evaluation Pipeline: Measure performance using EER, ROC-AUC, Accuracy, and confusion matrices.</w:t>
             </w:r>
@@ -2194,7 +2216,6 @@
                 <w:bCs/>
                 <w:sz w:val="24"/>
                 <w:szCs w:val="24"/>
-                <w:lang/>
               </w:rPr>
             </w:pPr>
             <w:r>
@@ -2202,7 +2223,6 @@
                 <w:bCs/>
                 <w:sz w:val="24"/>
                 <w:szCs w:val="24"/>
-                <w:lang/>
               </w:rPr>
               <w:t>Deployment: Package final model into a software tool capable of evaluating external test audio files.</w:t>
             </w:r>
@@ -2421,28 +2441,7 @@
                 <w:sz w:val="24"/>
                 <w:szCs w:val="24"/>
               </w:rPr>
-              <w:t>Week</w:t>
-            </w:r>
-            <w:r>
-              <w:rPr>
-                <w:sz w:val="24"/>
-                <w:szCs w:val="24"/>
-              </w:rPr>
-              <w:t xml:space="preserve"> </w:t>
-            </w:r>
-            <w:r>
-              <w:rPr>
-                <w:sz w:val="24"/>
-                <w:szCs w:val="24"/>
-              </w:rPr>
-              <w:t>1-</w:t>
-            </w:r>
-            <w:r>
-              <w:rPr>
-                <w:sz w:val="24"/>
-                <w:szCs w:val="24"/>
-              </w:rPr>
-              <w:t>4</w:t>
+              <w:t>Week 1-4</w:t>
             </w:r>
           </w:p>
         </w:tc>
@@ -3338,7 +3337,6 @@
                 <w:bCs/>
                 <w:sz w:val="24"/>
                 <w:szCs w:val="24"/>
-                <w:lang/>
               </w:rPr>
             </w:pPr>
             <w:r>
@@ -3346,7 +3344,6 @@
                 <w:bCs/>
                 <w:sz w:val="24"/>
                 <w:szCs w:val="24"/>
-                <w:lang/>
               </w:rPr>
               <w:t>A trained convolutional neural network-based classifier (LCNN) for synthetic speech detection.</w:t>
             </w:r>
@@ -3362,7 +3359,6 @@
                 <w:bCs/>
                 <w:sz w:val="24"/>
                 <w:szCs w:val="24"/>
-                <w:lang/>
               </w:rPr>
             </w:pPr>
             <w:r>
@@ -3370,7 +3366,6 @@
                 <w:bCs/>
                 <w:sz w:val="24"/>
                 <w:szCs w:val="24"/>
-                <w:lang/>
               </w:rPr>
               <w:t>Feature extraction module for LFCC and Log-Mel computation.</w:t>
             </w:r>
@@ -3386,7 +3381,6 @@
                 <w:bCs/>
                 <w:sz w:val="24"/>
                 <w:szCs w:val="24"/>
-                <w:lang/>
               </w:rPr>
             </w:pPr>
             <w:r>
@@ -3394,7 +3388,6 @@
                 <w:bCs/>
                 <w:sz w:val="24"/>
                 <w:szCs w:val="24"/>
-                <w:lang/>
               </w:rPr>
               <w:t>Augmentation engine capable of applying noise, reverberation, replay simulation, and codec effects.</w:t>
             </w:r>
@@ -3410,7 +3403,6 @@
                 <w:bCs/>
                 <w:sz w:val="24"/>
                 <w:szCs w:val="24"/>
-                <w:lang/>
               </w:rPr>
             </w:pPr>
             <w:r>
@@ -3418,7 +3410,6 @@
                 <w:bCs/>
                 <w:sz w:val="24"/>
                 <w:szCs w:val="24"/>
-                <w:lang/>
               </w:rPr>
               <w:t>HDF5-optimized feature loader for high-speed inference.</w:t>
             </w:r>
@@ -3434,7 +3425,6 @@
                 <w:bCs/>
                 <w:sz w:val="24"/>
                 <w:szCs w:val="24"/>
-                <w:lang/>
               </w:rPr>
             </w:pPr>
             <w:r>
@@ -3442,7 +3432,6 @@
                 <w:bCs/>
                 <w:sz w:val="24"/>
                 <w:szCs w:val="24"/>
-                <w:lang/>
               </w:rPr>
               <w:t>A complete evaluation and visualization pipeline (EER, AUC, learning curves).</w:t>
             </w:r>
@@ -3465,17 +3454,8 @@
                 <w:bCs/>
                 <w:sz w:val="24"/>
                 <w:szCs w:val="24"/>
-                <w:lang/>
-              </w:rPr>
-              <w:t>A user-friendly software interface/script for testing audio files</w:t>
-            </w:r>
-            <w:r>
-              <w:rPr>
-                <w:bCs/>
-                <w:sz w:val="24"/>
-                <w:szCs w:val="24"/>
-              </w:rPr>
-              <w:t>.</w:t>
+              </w:rPr>
+              <w:t>A user-friendly software interface/script for testing audio files.</w:t>
             </w:r>
           </w:p>
           <w:p>
@@ -3484,7 +3464,6 @@
                 <w:b/>
                 <w:sz w:val="24"/>
                 <w:szCs w:val="24"/>
-                <w:lang/>
               </w:rPr>
             </w:pPr>
           </w:p>
@@ -3573,8 +3552,10 @@
               <w:tblLook w:val="04A0" w:firstRow="1" w:lastRow="0" w:firstColumn="1" w:lastColumn="0" w:noHBand="0" w:noVBand="1"/>
             </w:tblPr>
             <w:tblGrid>
-              <w:gridCol w:w="2255"/>
-              <w:gridCol w:w="4228"/>
+              <w:gridCol w:w="2567"/>
+              <w:gridCol w:w="4053"/>
+              <w:gridCol w:w="66"/>
+              <w:gridCol w:w="2448"/>
             </w:tblGrid>
             <w:tr>
               <w:trPr>
@@ -3595,7 +3576,6 @@
                       <w:bCs/>
                       <w:sz w:val="24"/>
                       <w:szCs w:val="24"/>
-                      <w:lang/>
                     </w:rPr>
                   </w:pPr>
                   <w:r>
@@ -3604,7 +3584,6 @@
                       <w:bCs/>
                       <w:sz w:val="24"/>
                       <w:szCs w:val="24"/>
-                      <w:lang/>
                     </w:rPr>
                     <w:t>Item</w:t>
                   </w:r>
@@ -3624,7 +3603,6 @@
                       <w:bCs/>
                       <w:sz w:val="24"/>
                       <w:szCs w:val="24"/>
-                      <w:lang/>
                     </w:rPr>
                   </w:pPr>
                   <w:r>
@@ -3633,9 +3611,49 @@
                       <w:bCs/>
                       <w:sz w:val="24"/>
                       <w:szCs w:val="24"/>
-                      <w:lang/>
                     </w:rPr>
                     <w:t>Description</w:t>
+                  </w:r>
+                </w:p>
+              </w:tc>
+              <w:tc>
+                <w:tcPr>
+                  <w:tcW w:w="0" w:type="auto"/>
+                </w:tcPr>
+                <w:p>
+                  <w:pPr>
+                    <w:jc w:val="center"/>
+                    <w:rPr>
+                      <w:b/>
+                      <w:bCs/>
+                      <w:sz w:val="24"/>
+                      <w:szCs w:val="24"/>
+                    </w:rPr>
+                  </w:pPr>
+                </w:p>
+              </w:tc>
+              <w:tc>
+                <w:tcPr>
+                  <w:tcW w:w="2403" w:type="dxa"/>
+                </w:tcPr>
+                <w:p>
+                  <w:pPr>
+                    <w:jc w:val="center"/>
+                    <w:rPr>
+                      <w:b/>
+                      <w:bCs/>
+                      <w:sz w:val="24"/>
+                      <w:szCs w:val="24"/>
+                    </w:rPr>
+                  </w:pPr>
+                  <w:r>
+                    <w:rPr>
+                      <w:b/>
+                      <w:bCs/>
+                      <w:sz w:val="24"/>
+                      <w:szCs w:val="24"/>
+                    </w:rPr>
+                    <w:t>Budget</w:t>
                   </w:r>
                 </w:p>
               </w:tc>
@@ -3655,14 +3673,12 @@
                     <w:rPr>
                       <w:sz w:val="24"/>
                       <w:szCs w:val="24"/>
-                      <w:lang/>
                     </w:rPr>
                   </w:pPr>
                   <w:r>
                     <w:rPr>
                       <w:sz w:val="24"/>
                       <w:szCs w:val="24"/>
-                      <w:lang/>
                     </w:rPr>
                     <w:t>Laptop with GPU</w:t>
                   </w:r>
@@ -3679,16 +3695,123 @@
                     <w:rPr>
                       <w:sz w:val="24"/>
                       <w:szCs w:val="24"/>
-                      <w:lang/>
                     </w:rPr>
                   </w:pPr>
                   <w:r>
                     <w:rPr>
                       <w:sz w:val="24"/>
                       <w:szCs w:val="24"/>
-                      <w:lang/>
                     </w:rPr>
                     <w:t>RTX 3050 Laptop GPU (already available)</w:t>
+                  </w:r>
+                </w:p>
+              </w:tc>
+              <w:tc>
+                <w:tcPr>
+                  <w:tcW w:w="0" w:type="auto"/>
+                </w:tcPr>
+                <w:p>
+                  <w:pPr>
+                    <w:rPr>
+                      <w:sz w:val="24"/>
+                      <w:szCs w:val="24"/>
+                    </w:rPr>
+                  </w:pPr>
+                </w:p>
+              </w:tc>
+              <w:tc>
+                <w:tcPr>
+                  <w:tcW w:w="2403" w:type="dxa"/>
+                </w:tcPr>
+                <w:p>
+                  <w:pPr>
+                    <w:rPr>
+                      <w:sz w:val="24"/>
+                      <w:szCs w:val="24"/>
+                    </w:rPr>
+                  </w:pPr>
+                </w:p>
+              </w:tc>
+            </w:tr>
+            <w:tr>
+              <w:trPr>
+                <w:tblCellSpacing w:w="15" w:type="dxa"/>
+              </w:trPr>
+              <w:tc>
+                <w:tcPr>
+                  <w:tcW w:w="0" w:type="auto"/>
+                  <w:vAlign w:val="center"/>
+                  <w:hideMark/>
+                </w:tcPr>
+                <w:p>
+                  <w:pPr>
+                    <w:rPr>
+                      <w:sz w:val="24"/>
+                      <w:szCs w:val="24"/>
+                    </w:rPr>
+                  </w:pPr>
+                  <w:r>
+                    <w:rPr>
+                      <w:sz w:val="24"/>
+                      <w:szCs w:val="24"/>
+                    </w:rPr>
+                    <w:t>External SSD</w:t>
+                  </w:r>
+                </w:p>
+              </w:tc>
+              <w:tc>
+                <w:tcPr>
+                  <w:tcW w:w="0" w:type="auto"/>
+                  <w:vAlign w:val="center"/>
+                  <w:hideMark/>
+                </w:tcPr>
+                <w:p>
+                  <w:pPr>
+                    <w:rPr>
+                      <w:sz w:val="24"/>
+                      <w:szCs w:val="24"/>
+                    </w:rPr>
+                  </w:pPr>
+                  <w:r>
+                    <w:rPr>
+                      <w:sz w:val="24"/>
+                      <w:szCs w:val="24"/>
+                    </w:rPr>
+                    <w:t>Used for dataset storage and fast I/O</w:t>
+                  </w:r>
+                </w:p>
+              </w:tc>
+              <w:tc>
+                <w:tcPr>
+                  <w:tcW w:w="0" w:type="auto"/>
+                </w:tcPr>
+                <w:p>
+                  <w:pPr>
+                    <w:rPr>
+                      <w:sz w:val="24"/>
+                      <w:szCs w:val="24"/>
+                    </w:rPr>
+                  </w:pPr>
+                </w:p>
+              </w:tc>
+              <w:tc>
+                <w:tcPr>
+                  <w:tcW w:w="2403" w:type="dxa"/>
+                </w:tcPr>
+                <w:p>
+                  <w:pPr>
+                    <w:jc w:val="center"/>
+                    <w:rPr>
+                      <w:sz w:val="24"/>
+                      <w:szCs w:val="24"/>
+                    </w:rPr>
+                  </w:pPr>
+                  <w:r>
+                    <w:rPr>
+                      <w:sz w:val="24"/>
+                      <w:szCs w:val="24"/>
+                    </w:rPr>
+                    <w:t>1TB | 15K-16K</w:t>
                   </w:r>
                 </w:p>
               </w:tc>
@@ -3708,16 +3831,14 @@
                     <w:rPr>
                       <w:sz w:val="24"/>
                       <w:szCs w:val="24"/>
-                      <w:lang/>
                     </w:rPr>
                   </w:pPr>
                   <w:r>
                     <w:rPr>
                       <w:sz w:val="24"/>
                       <w:szCs w:val="24"/>
-                      <w:lang/>
                     </w:rPr>
-                    <w:t>External SSD</w:t>
+                    <w:t>Headphones</w:t>
                   </w:r>
                 </w:p>
               </w:tc>
@@ -3732,17 +3853,42 @@
                     <w:rPr>
                       <w:sz w:val="24"/>
                       <w:szCs w:val="24"/>
-                      <w:lang/>
                     </w:rPr>
                   </w:pPr>
                   <w:r>
                     <w:rPr>
                       <w:sz w:val="24"/>
                       <w:szCs w:val="24"/>
-                      <w:lang/>
                     </w:rPr>
-                    <w:t>Used for dataset storage and fast I/O</w:t>
+                    <w:t>For manual listening tests</w:t>
                   </w:r>
+                </w:p>
+              </w:tc>
+              <w:tc>
+                <w:tcPr>
+                  <w:tcW w:w="0" w:type="auto"/>
+                </w:tcPr>
+                <w:p>
+                  <w:pPr>
+                    <w:rPr>
+                      <w:sz w:val="24"/>
+                      <w:szCs w:val="24"/>
+                    </w:rPr>
+                  </w:pPr>
+                </w:p>
+              </w:tc>
+              <w:tc>
+                <w:tcPr>
+                  <w:tcW w:w="2403" w:type="dxa"/>
+                </w:tcPr>
+                <w:p>
+                  <w:pPr>
+                    <w:jc w:val="center"/>
+                    <w:rPr>
+                      <w:sz w:val="24"/>
+                      <w:szCs w:val="24"/>
+                    </w:rPr>
+                  </w:pPr>
                 </w:p>
               </w:tc>
             </w:tr>
@@ -3761,16 +3907,14 @@
                     <w:rPr>
                       <w:sz w:val="24"/>
                       <w:szCs w:val="24"/>
-                      <w:lang/>
                     </w:rPr>
                   </w:pPr>
                   <w:r>
                     <w:rPr>
                       <w:sz w:val="24"/>
                       <w:szCs w:val="24"/>
-                      <w:lang/>
                     </w:rPr>
-                    <w:t>Headphones</w:t>
+                    <w:t>Microphone (optional)</w:t>
                   </w:r>
                 </w:p>
               </w:tc>
@@ -3785,17 +3929,42 @@
                     <w:rPr>
                       <w:sz w:val="24"/>
                       <w:szCs w:val="24"/>
-                      <w:lang/>
                     </w:rPr>
                   </w:pPr>
                   <w:r>
                     <w:rPr>
                       <w:sz w:val="24"/>
                       <w:szCs w:val="24"/>
-                      <w:lang/>
                     </w:rPr>
-                    <w:t>For manual listening tests</w:t>
+                    <w:t>For replay attack recordings</w:t>
                   </w:r>
+                </w:p>
+              </w:tc>
+              <w:tc>
+                <w:tcPr>
+                  <w:tcW w:w="0" w:type="auto"/>
+                </w:tcPr>
+                <w:p>
+                  <w:pPr>
+                    <w:rPr>
+                      <w:sz w:val="24"/>
+                      <w:szCs w:val="24"/>
+                    </w:rPr>
+                  </w:pPr>
+                </w:p>
+              </w:tc>
+              <w:tc>
+                <w:tcPr>
+                  <w:tcW w:w="2403" w:type="dxa"/>
+                </w:tcPr>
+                <w:p>
+                  <w:pPr>
+                    <w:jc w:val="center"/>
+                    <w:rPr>
+                      <w:sz w:val="24"/>
+                      <w:szCs w:val="24"/>
+                    </w:rPr>
+                  </w:pPr>
                 </w:p>
               </w:tc>
             </w:tr>
@@ -3814,67 +3983,12 @@
                     <w:rPr>
                       <w:sz w:val="24"/>
                       <w:szCs w:val="24"/>
-                      <w:lang/>
                     </w:rPr>
                   </w:pPr>
                   <w:r>
                     <w:rPr>
                       <w:sz w:val="24"/>
                       <w:szCs w:val="24"/>
-                      <w:lang/>
-                    </w:rPr>
-                    <w:t>Microphone (optional)</w:t>
-                  </w:r>
-                </w:p>
-              </w:tc>
-              <w:tc>
-                <w:tcPr>
-                  <w:tcW w:w="0" w:type="auto"/>
-                  <w:vAlign w:val="center"/>
-                  <w:hideMark/>
-                </w:tcPr>
-                <w:p>
-                  <w:pPr>
-                    <w:rPr>
-                      <w:sz w:val="24"/>
-                      <w:szCs w:val="24"/>
-                      <w:lang/>
-                    </w:rPr>
-                  </w:pPr>
-                  <w:r>
-                    <w:rPr>
-                      <w:sz w:val="24"/>
-                      <w:szCs w:val="24"/>
-                      <w:lang/>
-                    </w:rPr>
-                    <w:t>For replay attack recordings</w:t>
-                  </w:r>
-                </w:p>
-              </w:tc>
-            </w:tr>
-            <w:tr>
-              <w:trPr>
-                <w:tblCellSpacing w:w="15" w:type="dxa"/>
-              </w:trPr>
-              <w:tc>
-                <w:tcPr>
-                  <w:tcW w:w="0" w:type="auto"/>
-                  <w:vAlign w:val="center"/>
-                  <w:hideMark/>
-                </w:tcPr>
-                <w:p>
-                  <w:pPr>
-                    <w:rPr>
-                      <w:sz w:val="24"/>
-                      <w:szCs w:val="24"/>
-                      <w:lang/>
-                    </w:rPr>
-                  </w:pPr>
-                  <w:r>
-                    <w:rPr>
-                      <w:sz w:val="24"/>
-                      <w:szCs w:val="24"/>
-                      <w:lang/>
                     </w:rPr>
                     <w:t>Software Libraries</w:t>
                   </w:r>
@@ -3891,16 +4005,115 @@
                     <w:rPr>
                       <w:sz w:val="24"/>
                       <w:szCs w:val="24"/>
-                      <w:lang/>
                     </w:rPr>
                   </w:pPr>
                   <w:r>
                     <w:rPr>
                       <w:sz w:val="24"/>
                       <w:szCs w:val="24"/>
-                      <w:lang/>
                     </w:rPr>
                     <w:t>Python, PyTorch, Librosa (open-source)</w:t>
+                  </w:r>
+                </w:p>
+              </w:tc>
+              <w:tc>
+                <w:tcPr>
+                  <w:tcW w:w="0" w:type="auto"/>
+                </w:tcPr>
+                <w:p>
+                  <w:pPr>
+                    <w:rPr>
+                      <w:sz w:val="24"/>
+                      <w:szCs w:val="24"/>
+                    </w:rPr>
+                  </w:pPr>
+                </w:p>
+              </w:tc>
+              <w:tc>
+                <w:tcPr>
+                  <w:tcW w:w="2403" w:type="dxa"/>
+                </w:tcPr>
+                <w:p>
+                  <w:pPr>
+                    <w:jc w:val="center"/>
+                    <w:rPr>
+                      <w:sz w:val="24"/>
+                      <w:szCs w:val="24"/>
+                    </w:rPr>
+                  </w:pPr>
+                </w:p>
+              </w:tc>
+            </w:tr>
+            <w:tr>
+              <w:trPr>
+                <w:tblCellSpacing w:w="15" w:type="dxa"/>
+              </w:trPr>
+              <w:tc>
+                <w:tcPr>
+                  <w:tcW w:w="0" w:type="auto"/>
+                  <w:vAlign w:val="center"/>
+                </w:tcPr>
+                <w:p>
+                  <w:pPr>
+                    <w:rPr>
+                      <w:sz w:val="24"/>
+                      <w:szCs w:val="24"/>
+                    </w:rPr>
+                  </w:pPr>
+                  <w:r>
+                    <w:rPr>
+                      <w:sz w:val="24"/>
+                      <w:szCs w:val="24"/>
+                    </w:rPr>
+                    <w:t>Deployment &amp; AI Support</w:t>
+                  </w:r>
+                </w:p>
+              </w:tc>
+              <w:tc>
+                <w:tcPr>
+                  <w:tcW w:w="0" w:type="auto"/>
+                  <w:vAlign w:val="center"/>
+                </w:tcPr>
+                <w:p>
+                  <w:pPr>
+                    <w:rPr>
+                      <w:sz w:val="24"/>
+                      <w:szCs w:val="24"/>
+                    </w:rPr>
+                  </w:pPr>
+                </w:p>
+              </w:tc>
+              <w:tc>
+                <w:tcPr>
+                  <w:tcW w:w="0" w:type="auto"/>
+                </w:tcPr>
+                <w:p>
+                  <w:pPr>
+                    <w:rPr>
+                      <w:sz w:val="24"/>
+                      <w:szCs w:val="24"/>
+                    </w:rPr>
+                  </w:pPr>
+                </w:p>
+              </w:tc>
+              <w:tc>
+                <w:tcPr>
+                  <w:tcW w:w="2403" w:type="dxa"/>
+                </w:tcPr>
+                <w:p>
+                  <w:pPr>
+                    <w:jc w:val="center"/>
+                    <w:rPr>
+                      <w:sz w:val="24"/>
+                      <w:szCs w:val="24"/>
+                    </w:rPr>
+                  </w:pPr>
+                  <w:r>
+                    <w:rPr>
+                      <w:sz w:val="24"/>
+                      <w:szCs w:val="24"/>
+                    </w:rPr>
+                    <w:t>24K</w:t>
                   </w:r>
                 </w:p>
               </w:tc>
@@ -3997,7 +4210,6 @@
                 <w:bCs/>
                 <w:sz w:val="24"/>
                 <w:szCs w:val="24"/>
-                <w:lang/>
               </w:rPr>
             </w:pPr>
             <w:r>
@@ -4005,7 +4217,6 @@
                 <w:bCs/>
                 <w:sz w:val="24"/>
                 <w:szCs w:val="24"/>
-                <w:lang/>
               </w:rPr>
               <w:t>Helps prevent misuse of AI-generated voices in fraud, impersonation, and misinformation.</w:t>
             </w:r>
@@ -4021,7 +4232,6 @@
                 <w:bCs/>
                 <w:sz w:val="24"/>
                 <w:szCs w:val="24"/>
-                <w:lang/>
               </w:rPr>
             </w:pPr>
             <w:r>
@@ -4029,7 +4239,6 @@
                 <w:bCs/>
                 <w:sz w:val="24"/>
                 <w:szCs w:val="24"/>
-                <w:lang/>
               </w:rPr>
               <w:t>Supports forensic investigations by identifying manipulated or replayed audio.</w:t>
             </w:r>
@@ -4045,7 +4254,6 @@
                 <w:bCs/>
                 <w:sz w:val="24"/>
                 <w:szCs w:val="24"/>
-                <w:lang/>
               </w:rPr>
             </w:pPr>
             <w:r>
@@ -4053,7 +4261,6 @@
                 <w:bCs/>
                 <w:sz w:val="24"/>
                 <w:szCs w:val="24"/>
-                <w:lang/>
               </w:rPr>
               <w:t>Useful for telecom, banking, and voice authentication systems.</w:t>
             </w:r>
@@ -4069,7 +4276,6 @@
                 <w:bCs/>
                 <w:sz w:val="24"/>
                 <w:szCs w:val="24"/>
-                <w:lang/>
               </w:rPr>
             </w:pPr>
             <w:r>
@@ -4077,7 +4283,6 @@
                 <w:bCs/>
                 <w:sz w:val="24"/>
                 <w:szCs w:val="24"/>
-                <w:lang/>
               </w:rPr>
               <w:t>Contributes to national cybersecurity by strengthening voice-based identity verification.</w:t>
             </w:r>
@@ -4093,7 +4298,6 @@
                 <w:b/>
                 <w:sz w:val="24"/>
                 <w:szCs w:val="24"/>
-                <w:lang/>
               </w:rPr>
             </w:pPr>
             <w:r>
@@ -4101,7 +4305,6 @@
                 <w:bCs/>
                 <w:sz w:val="24"/>
                 <w:szCs w:val="24"/>
-                <w:lang/>
               </w:rPr>
               <w:t>Provides a foundation for future research in synthetic media detection</w:t>
             </w:r>
@@ -4120,7 +4323,6 @@
                 <w:b/>
                 <w:sz w:val="24"/>
                 <w:szCs w:val="24"/>
-                <w:lang/>
               </w:rPr>
             </w:pPr>
           </w:p>
@@ -4331,6 +4533,85 @@
           <w:szCs w:val="24"/>
         </w:rPr>
       </w:pPr>
+      <w:r>
+        <w:rPr>
+          <w:b/>
+          <w:noProof/>
+        </w:rPr>
+        <w:drawing>
+          <wp:anchor distT="0" distB="0" distL="114300" distR="114300" simplePos="0" relativeHeight="251659264" behindDoc="0" locked="0" layoutInCell="1" allowOverlap="1" wp14:anchorId="3621F5EE" wp14:editId="298BBBEE">
+            <wp:simplePos x="0" y="0"/>
+            <wp:positionH relativeFrom="column">
+              <wp:posOffset>2286000</wp:posOffset>
+            </wp:positionH>
+            <wp:positionV relativeFrom="paragraph">
+              <wp:posOffset>57150</wp:posOffset>
+            </wp:positionV>
+            <wp:extent cx="891540" cy="673100"/>
+            <wp:effectExtent l="0" t="0" r="0" b="0"/>
+            <wp:wrapNone/>
+            <wp:docPr id="1688366903" name="Picture 2" descr="A blue signature on a black background&#10;&#10;AI-generated content may be incorrect."/>
+            <wp:cNvGraphicFramePr>
+              <a:graphicFrameLocks xmlns:a="http://schemas.openxmlformats.org/drawingml/2006/main" noChangeAspect="1"/>
+            </wp:cNvGraphicFramePr>
+            <a:graphic xmlns:a="http://schemas.openxmlformats.org/drawingml/2006/main">
+              <a:graphicData uri="http://schemas.openxmlformats.org/drawingml/2006/picture">
+                <pic:pic xmlns:pic="http://schemas.openxmlformats.org/drawingml/2006/picture">
+                  <pic:nvPicPr>
+                    <pic:cNvPr id="1688366903" name="Picture 2" descr="A blue signature on a black background&#10;&#10;AI-generated content may be incorrect."/>
+                    <pic:cNvPicPr/>
+                  </pic:nvPicPr>
+                  <pic:blipFill rotWithShape="1">
+                    <a:blip r:embed="rId13" cstate="print">
+                      <a:extLst>
+                        <a:ext uri="{BEBA8EAE-BF5A-486C-A8C5-ECC9F3942E4B}">
+                          <a14:imgProps xmlns:a14="http://schemas.microsoft.com/office/drawing/2010/main">
+                            <a14:imgLayer r:embed="rId14">
+                              <a14:imgEffect>
+                                <a14:backgroundRemoval t="10000" b="90000" l="10000" r="90000"/>
+                              </a14:imgEffect>
+                            </a14:imgLayer>
+                          </a14:imgProps>
+                        </a:ext>
+                        <a:ext uri="{28A0092B-C50C-407E-A947-70E740481C1C}">
+                          <a14:useLocalDpi xmlns:a14="http://schemas.microsoft.com/office/drawing/2010/main" val="0"/>
+                        </a:ext>
+                      </a:extLst>
+                    </a:blip>
+                    <a:srcRect t="22088" r="15085" b="14425"/>
+                    <a:stretch>
+                      <a:fillRect/>
+                    </a:stretch>
+                  </pic:blipFill>
+                  <pic:spPr bwMode="auto">
+                    <a:xfrm>
+                      <a:off x="0" y="0"/>
+                      <a:ext cx="891540" cy="673100"/>
+                    </a:xfrm>
+                    <a:prstGeom prst="rect">
+                      <a:avLst/>
+                    </a:prstGeom>
+                    <a:ln>
+                      <a:noFill/>
+                    </a:ln>
+                    <a:extLst>
+                      <a:ext uri="{53640926-AAD7-44D8-BBD7-CCE9431645EC}">
+                        <a14:shadowObscured xmlns:a14="http://schemas.microsoft.com/office/drawing/2010/main"/>
+                      </a:ext>
+                    </a:extLst>
+                  </pic:spPr>
+                </pic:pic>
+              </a:graphicData>
+            </a:graphic>
+            <wp14:sizeRelH relativeFrom="margin">
+              <wp14:pctWidth>0</wp14:pctWidth>
+            </wp14:sizeRelH>
+            <wp14:sizeRelV relativeFrom="margin">
+              <wp14:pctHeight>0</wp14:pctHeight>
+            </wp14:sizeRelV>
+          </wp:anchor>
+        </w:drawing>
+      </w:r>
     </w:p>
     <w:p>
       <w:pPr>
@@ -4628,7 +4909,7 @@
     </w:p>
     <w:p/>
     <w:sectPr>
-      <w:headerReference w:type="default" r:id="rId13"/>
+      <w:headerReference w:type="default" r:id="rId15"/>
       <w:pgSz w:w="12240" w:h="15840"/>
       <w:pgMar w:top="1440" w:right="1440" w:bottom="1440" w:left="1440" w:header="720" w:footer="720" w:gutter="0"/>
       <w:cols w:space="720"/>
@@ -6289,6 +6570,7 @@
   <w:style w:type="character" w:default="1" w:styleId="DefaultParagraphFont">
     <w:name w:val="Default Paragraph Font"/>
     <w:uiPriority w:val="1"/>
+    <w:semiHidden/>
     <w:unhideWhenUsed/>
   </w:style>
   <w:style w:type="table" w:default="1" w:styleId="TableNormal">
@@ -6699,15 +6981,12 @@
 </file>
 
 <file path=customXml/item1.xml><?xml version="1.0" encoding="utf-8"?>
-<p:properties xmlns:p="http://schemas.microsoft.com/office/2006/metadata/properties" xmlns:xsi="http://www.w3.org/2001/XMLSchema-instance" xmlns:pc="http://schemas.microsoft.com/office/infopath/2007/PartnerControls">
-  <documentManagement>
-    <lcf76f155ced4ddcb4097134ff3c332f xmlns="e5cc5340-a36e-4545-a029-2ed461ab2ca1">
-      <Terms xmlns="http://schemas.microsoft.com/office/infopath/2007/PartnerControls"/>
-    </lcf76f155ced4ddcb4097134ff3c332f>
-    <ReferenceId xmlns="e5cc5340-a36e-4545-a029-2ed461ab2ca1" xsi:nil="true"/>
-    <TaxCatchAll xmlns="7ba4a36e-a263-41bb-9771-96b0a3f88c3e" xsi:nil="true"/>
-  </documentManagement>
-</p:properties>
+<?mso-contentType ?>
+<FormTemplates xmlns="http://schemas.microsoft.com/sharepoint/v3/contenttype/forms">
+  <Display>DocumentLibraryForm</Display>
+  <Edit>DocumentLibraryForm</Edit>
+  <New>DocumentLibraryForm</New>
+</FormTemplates>
 </file>
 
 <file path=customXml/item2.xml><?xml version="1.0" encoding="utf-8"?>
@@ -6898,21 +7177,21 @@
 </file>
 
 <file path=customXml/item3.xml><?xml version="1.0" encoding="utf-8"?>
-<?mso-contentType ?>
-<FormTemplates xmlns="http://schemas.microsoft.com/sharepoint/v3/contenttype/forms">
-  <Display>DocumentLibraryForm</Display>
-  <Edit>DocumentLibraryForm</Edit>
-  <New>DocumentLibraryForm</New>
-</FormTemplates>
+<p:properties xmlns:p="http://schemas.microsoft.com/office/2006/metadata/properties" xmlns:xsi="http://www.w3.org/2001/XMLSchema-instance" xmlns:pc="http://schemas.microsoft.com/office/infopath/2007/PartnerControls">
+  <documentManagement>
+    <lcf76f155ced4ddcb4097134ff3c332f xmlns="e5cc5340-a36e-4545-a029-2ed461ab2ca1">
+      <Terms xmlns="http://schemas.microsoft.com/office/infopath/2007/PartnerControls"/>
+    </lcf76f155ced4ddcb4097134ff3c332f>
+    <ReferenceId xmlns="e5cc5340-a36e-4545-a029-2ed461ab2ca1" xsi:nil="true"/>
+    <TaxCatchAll xmlns="7ba4a36e-a263-41bb-9771-96b0a3f88c3e" xsi:nil="true"/>
+  </documentManagement>
+</p:properties>
 </file>
 
 <file path=customXml/itemProps1.xml><?xml version="1.0" encoding="utf-8"?>
-<ds:datastoreItem xmlns:ds="http://schemas.openxmlformats.org/officeDocument/2006/customXml" ds:itemID="{3AA53B75-9252-4E9B-BB0E-1EAFFB4EFD15}">
+<ds:datastoreItem xmlns:ds="http://schemas.openxmlformats.org/officeDocument/2006/customXml" ds:itemID="{D6726065-969D-45AA-82D2-2D5268C58C19}">
   <ds:schemaRefs>
-    <ds:schemaRef ds:uri="http://schemas.microsoft.com/office/2006/metadata/properties"/>
-    <ds:schemaRef ds:uri="http://schemas.microsoft.com/office/infopath/2007/PartnerControls"/>
-    <ds:schemaRef ds:uri="e5cc5340-a36e-4545-a029-2ed461ab2ca1"/>
-    <ds:schemaRef ds:uri="7ba4a36e-a263-41bb-9771-96b0a3f88c3e"/>
+    <ds:schemaRef ds:uri="http://schemas.microsoft.com/sharepoint/v3/contenttype/forms"/>
   </ds:schemaRefs>
 </ds:datastoreItem>
 </file>
@@ -6937,9 +7216,12 @@
 </file>
 
 <file path=customXml/itemProps3.xml><?xml version="1.0" encoding="utf-8"?>
-<ds:datastoreItem xmlns:ds="http://schemas.openxmlformats.org/officeDocument/2006/customXml" ds:itemID="{D6726065-969D-45AA-82D2-2D5268C58C19}">
+<ds:datastoreItem xmlns:ds="http://schemas.openxmlformats.org/officeDocument/2006/customXml" ds:itemID="{3AA53B75-9252-4E9B-BB0E-1EAFFB4EFD15}">
   <ds:schemaRefs>
-    <ds:schemaRef ds:uri="http://schemas.microsoft.com/sharepoint/v3/contenttype/forms"/>
+    <ds:schemaRef ds:uri="http://schemas.microsoft.com/office/2006/metadata/properties"/>
+    <ds:schemaRef ds:uri="http://schemas.microsoft.com/office/infopath/2007/PartnerControls"/>
+    <ds:schemaRef ds:uri="e5cc5340-a36e-4545-a029-2ed461ab2ca1"/>
+    <ds:schemaRef ds:uri="7ba4a36e-a263-41bb-9771-96b0a3f88c3e"/>
   </ds:schemaRefs>
 </ds:datastoreItem>
 </file>
</xml_diff>